<commit_message>
Fix monetization model: partner revenue share, consistent ARPU/wage, honest evidence pack
- Add 20% partner revenue share to 2_Pricing (net GM 68.61%, breakeven 77.41%)
- Compute CAC budget on net GM (19.4x gap); align ARPU with ~250 tickets/shop
- Fix wage anchor (~$350), single partner (Haravan), contact status, placeholder owner
- Mark pilot report as target; remove unsupported retry claim; correct stress-test numbers

Co-Authored-By: Claude Sonnet 5.5 <noreply@anthropic.com>
</commit_message>
<xml_diff>
--- a/day22_one_pager_template.docx
+++ b/day22_one_pager_template.docx
@@ -88,7 +88,7 @@
         <w:rPr/>
       </w:pPr>
       <w:r>
-        <w:t>Value Metric đã chọn: OUTCOME ($0,99 / resolution)     Kênh đã chọn: Partner-Led (Pancake / Haravan)     Ngày: 08/10/2026</w:t>
+        <w:t>Value Metric đã chọn: OUTCOME ($0,99 / resolution)     Kênh đã chọn: Partner-Led (Haravan)     Ngày: 08/10/2026</w:t>
       </w:r>
     </w:p>
     <w:p>
@@ -106,7 +106,7 @@
           <w:szCs w:val="16"/>
           <w:rtl w:val="0"/>
         </w:rPr>
-        <w:t xml:space="preserve">Mọi con số dưới đây phải truy được về một ô trong day2</w:t>
+        <w:t>Định vị: AutoResolve AI thay ca trực CSKH đêm của shop SME bán lẻ/e-commerce trên Haravan — tính $0,99 cho mỗi ticket được giải quyết xong. Job = 1 ticket mà khách xác nhận xong hoặc không hỏi lại sau 24h (1_Cost_Job!B5).</w:t>
       </w:r>
       <w:r>
         <w:rPr>
@@ -117,7 +117,6 @@
           <w:szCs w:val="16"/>
           <w:rtl w:val="0"/>
         </w:rPr>
-        <w:t xml:space="preserve">2</w:t>
       </w:r>
       <w:r>
         <w:rPr>
@@ -129,6 +128,51 @@
           <w:szCs w:val="16"/>
           <w:rtl w:val="0"/>
         </w:rPr>
+      </w:r>
+      <w:r>
+        <w:rPr>
+          <w:rtl w:val="0"/>
+        </w:rPr>
+      </w:r>
+    </w:p>
+    <w:p>
+      <w:pPr>
+        <w:spacing w:after="200" w:before="0" w:lineRule="auto"/>
+        <w:rPr/>
+      </w:pPr>
+      <w:r>
+        <w:rPr>
+          <w:rFonts w:ascii="Arial" w:cs="Arial" w:eastAsia="Arial" w:hAnsi="Arial"/>
+          <w:i w:val="1"/>
+          <w:iCs w:val="1"/>
+          <w:color w:val="666666"/>
+          <w:sz w:val="16"/>
+          <w:szCs w:val="16"/>
+          <w:rtl w:val="0"/>
+        </w:rPr>
+        <w:t xml:space="preserve">Mọi con số dưới đây phải truy được về một ô trong day2</w:t>
+      </w:r>
+      <w:r>
+        <w:rPr>
+          <w:i w:val="1"/>
+          <w:iCs w:val="1"/>
+          <w:color w:val="666666"/>
+          <w:sz w:val="16"/>
+          <w:szCs w:val="16"/>
+          <w:rtl w:val="0"/>
+        </w:rPr>
+        <w:t xml:space="preserve">2</w:t>
+      </w:r>
+      <w:r>
+        <w:rPr>
+          <w:rFonts w:ascii="Arial" w:cs="Arial" w:eastAsia="Arial" w:hAnsi="Arial"/>
+          <w:i w:val="1"/>
+          <w:iCs w:val="1"/>
+          <w:color w:val="666666"/>
+          <w:sz w:val="16"/>
+          <w:szCs w:val="16"/>
+          <w:rtl w:val="0"/>
+        </w:rPr>
         <w:t xml:space="preserve">_monetization_model.xlsx. Số không có lý do = số ảo.</w:t>
       </w:r>
       <w:r>
@@ -227,7 +271,7 @@
         <w:rPr/>
       </w:pPr>
       <w:r>
-        <w:t>Người ký duyệt: Trưởng phòng CSKH / Trưởng bộ phận Vận hành (Operations Lead) hoặc Chủ doanh nghiệp SME (Owner/Founder). Tiêu chí phê duyệt: Chi phí trả theo kết quả hàng tháng rẻ hơn đáng kể so với lương 1 nhân sự trực đêm (khoảng 8–10 triệu ₫/tháng) và giảm tỷ lệ mất đơn do khách chờ quá 5 phút.</w:t>
+        <w:t>Người ký duyệt: Trưởng phòng CSKH / Trưởng bộ phận Vận hành (Operations Lead) hoặc Chủ doanh nghiệp SME (Owner/Founder). Tiêu chí phê duyệt: Chi phí trả theo kết quả (~$203/tháng cho shop ~250 ticket) bằng khoảng 58% lương 1 nhân sự trực đêm (8–10 triệu ₫ ≈ $350/tháng) nhưng phủ 24/7, chỉ trả khi ticket được giải quyết, và giảm tỷ lệ mất đơn do khách chờ quá 5 phút.</w:t>
       </w:r>
     </w:p>
     <w:p>
@@ -841,27 +885,27 @@
                 <w:szCs w:val="18"/>
                 <w:rtl w:val="0"/>
               </w:rPr>
-              <w:t xml:space="preserve">Gross Margin</w:t>
-            </w:r>
-            <w:r>
-              <w:rPr>
-                <w:rtl w:val="0"/>
-              </w:rPr>
-            </w:r>
-          </w:p>
-        </w:tc>
-        <w:tc>
-          <w:tcPr>
-            <w:tcMar>
-              <w:top w:w="60.0" w:type="dxa"/>
-              <w:left w:w="100.0" w:type="dxa"/>
-              <w:bottom w:w="60.0" w:type="dxa"/>
-              <w:right w:w="100.0" w:type="dxa"/>
-            </w:tcMar>
-          </w:tcPr>
-          <w:p>
-            <w:r>
-              <w:t>74,89% (Đạt an toàn ≥ 60%)</w:t>
+              <w:t>Giá ròng sau 20% revenue share</w:t>
+            </w:r>
+            <w:r>
+              <w:rPr>
+                <w:rtl w:val="0"/>
+              </w:rPr>
+            </w:r>
+          </w:p>
+        </w:tc>
+        <w:tc>
+          <w:tcPr>
+            <w:tcMar>
+              <w:top w:w="60.0" w:type="dxa"/>
+              <w:left w:w="100.0" w:type="dxa"/>
+              <w:bottom w:w="60.0" w:type="dxa"/>
+              <w:right w:w="100.0" w:type="dxa"/>
+            </w:tcMar>
+          </w:tcPr>
+          <w:p>
+            <w:r>
+              <w:t>$0,792 / job</w:t>
             </w:r>
           </w:p>
         </w:tc>
@@ -890,7 +934,7 @@
                 <w:szCs w:val="16"/>
                 <w:rtl w:val="0"/>
               </w:rPr>
-              <w:t xml:space="preserve">2_Pricing!B21</w:t>
+              <w:t>2_Pricing!B57</w:t>
             </w:r>
             <w:r>
               <w:rPr>
@@ -930,27 +974,27 @@
                 <w:szCs w:val="18"/>
                 <w:rtl w:val="0"/>
               </w:rPr>
-              <w:t xml:space="preserve">Breakeven containment</w:t>
-            </w:r>
-            <w:r>
-              <w:rPr>
-                <w:rtl w:val="0"/>
-              </w:rPr>
-            </w:r>
-          </w:p>
-        </w:tc>
-        <w:tc>
-          <w:tcPr>
-            <w:tcMar>
-              <w:top w:w="60.0" w:type="dxa"/>
-              <w:left w:w="100.0" w:type="dxa"/>
-              <w:bottom w:w="60.0" w:type="dxa"/>
-              <w:right w:w="100.0" w:type="dxa"/>
-            </w:tcMar>
-          </w:tcPr>
-          <w:p>
-            <w:r>
-              <w:t>72,68% (Ngưỡng sống còn)</w:t>
+              <w:t>Gross Margin (trước chia sẻ partner)</w:t>
+            </w:r>
+            <w:r>
+              <w:rPr>
+                <w:rtl w:val="0"/>
+              </w:rPr>
+            </w:r>
+          </w:p>
+        </w:tc>
+        <w:tc>
+          <w:tcPr>
+            <w:tcMar>
+              <w:top w:w="60.0" w:type="dxa"/>
+              <w:left w:w="100.0" w:type="dxa"/>
+              <w:bottom w:w="60.0" w:type="dxa"/>
+              <w:right w:w="100.0" w:type="dxa"/>
+            </w:tcMar>
+          </w:tcPr>
+          <w:p>
+            <w:r>
+              <w:t>74,89%</w:t>
             </w:r>
           </w:p>
         </w:tc>
@@ -979,7 +1023,7 @@
                 <w:szCs w:val="16"/>
                 <w:rtl w:val="0"/>
               </w:rPr>
-              <w:t xml:space="preserve">2_Pricing!B33</w:t>
+              <w:t xml:space="preserve">2_Pricing!B21</w:t>
             </w:r>
             <w:r>
               <w:rPr>
@@ -1019,27 +1063,27 @@
                 <w:szCs w:val="18"/>
                 <w:rtl w:val="0"/>
               </w:rPr>
-              <w:t xml:space="preserve">Containment hiện tại </w:t>
-            </w:r>
-            <w:r>
-              <w:rPr>
-                <w:rtl w:val="0"/>
-              </w:rPr>
-            </w:r>
-          </w:p>
-        </w:tc>
-        <w:tc>
-          <w:tcPr>
-            <w:tcMar>
-              <w:top w:w="60.0" w:type="dxa"/>
-              <w:left w:w="100.0" w:type="dxa"/>
-              <w:bottom w:w="60.0" w:type="dxa"/>
-              <w:right w:w="100.0" w:type="dxa"/>
-            </w:tcMar>
-          </w:tcPr>
-          <w:p>
-            <w:r>
-              <w:t>82,00% (Từ bộ Eval thực tế)</w:t>
+              <w:t>Gross Margin sau revenue share</w:t>
+            </w:r>
+            <w:r>
+              <w:rPr>
+                <w:rtl w:val="0"/>
+              </w:rPr>
+            </w:r>
+          </w:p>
+        </w:tc>
+        <w:tc>
+          <w:tcPr>
+            <w:tcMar>
+              <w:top w:w="60.0" w:type="dxa"/>
+              <w:left w:w="100.0" w:type="dxa"/>
+              <w:bottom w:w="60.0" w:type="dxa"/>
+              <w:right w:w="100.0" w:type="dxa"/>
+            </w:tcMar>
+          </w:tcPr>
+          <w:p>
+            <w:r>
+              <w:t>68,61% (≥ 60%)</w:t>
             </w:r>
           </w:p>
         </w:tc>
@@ -1068,7 +1112,274 @@
                 <w:szCs w:val="16"/>
                 <w:rtl w:val="0"/>
               </w:rPr>
+              <w:t>2_Pricing!B59</w:t>
+            </w:r>
+            <w:r>
+              <w:rPr>
+                <w:rtl w:val="0"/>
+              </w:rPr>
+            </w:r>
+          </w:p>
+        </w:tc>
+      </w:tr>
+      <w:tr>
+        <w:trPr>
+          <w:cantSplit w:val="0"/>
+          <w:tblHeader w:val="0"/>
+        </w:trPr>
+        <w:tc>
+          <w:tcPr>
+            <w:tcMar>
+              <w:top w:w="60.0" w:type="dxa"/>
+              <w:left w:w="100.0" w:type="dxa"/>
+              <w:bottom w:w="60.0" w:type="dxa"/>
+              <w:right w:w="100.0" w:type="dxa"/>
+            </w:tcMar>
+          </w:tcPr>
+          <w:p>
+            <w:pPr>
+              <w:spacing w:after="0" w:lineRule="auto"/>
+              <w:rPr/>
+            </w:pPr>
+            <w:r>
+              <w:rPr>
+                <w:rFonts w:ascii="Arial" w:cs="Arial" w:eastAsia="Arial" w:hAnsi="Arial"/>
+                <w:b w:val="0"/>
+                <w:bCs w:val="0"/>
+                <w:i w:val="0"/>
+                <w:iCs w:val="0"/>
+                <w:sz w:val="18"/>
+                <w:szCs w:val="18"/>
+                <w:rtl w:val="0"/>
+              </w:rPr>
+              <w:t>Breakeven containment sau revenue share</w:t>
+            </w:r>
+            <w:r>
+              <w:rPr>
+                <w:rtl w:val="0"/>
+              </w:rPr>
+            </w:r>
+          </w:p>
+        </w:tc>
+        <w:tc>
+          <w:tcPr>
+            <w:tcMar>
+              <w:top w:w="60.0" w:type="dxa"/>
+              <w:left w:w="100.0" w:type="dxa"/>
+              <w:bottom w:w="60.0" w:type="dxa"/>
+              <w:right w:w="100.0" w:type="dxa"/>
+            </w:tcMar>
+          </w:tcPr>
+          <w:p>
+            <w:r>
+              <w:t>77,41% (trước chia sẻ: 72,68% — 2_Pricing!B33)</w:t>
+            </w:r>
+          </w:p>
+        </w:tc>
+        <w:tc>
+          <w:tcPr>
+            <w:tcMar>
+              <w:top w:w="60.0" w:type="dxa"/>
+              <w:left w:w="100.0" w:type="dxa"/>
+              <w:bottom w:w="60.0" w:type="dxa"/>
+              <w:right w:w="100.0" w:type="dxa"/>
+            </w:tcMar>
+          </w:tcPr>
+          <w:p>
+            <w:pPr>
+              <w:spacing w:after="0" w:lineRule="auto"/>
+              <w:rPr/>
+            </w:pPr>
+            <w:r>
+              <w:rPr>
+                <w:rFonts w:ascii="Arial" w:cs="Arial" w:eastAsia="Arial" w:hAnsi="Arial"/>
+                <w:b w:val="0"/>
+                <w:bCs w:val="0"/>
+                <w:i w:val="0"/>
+                <w:iCs w:val="0"/>
+                <w:sz w:val="16"/>
+                <w:szCs w:val="16"/>
+                <w:rtl w:val="0"/>
+              </w:rPr>
+              <w:t>2_Pricing!B60</w:t>
+            </w:r>
+            <w:r>
+              <w:rPr>
+                <w:rtl w:val="0"/>
+              </w:rPr>
+            </w:r>
+          </w:p>
+        </w:tc>
+      </w:tr>
+      <w:tr>
+        <w:trPr>
+          <w:cantSplit w:val="0"/>
+          <w:tblHeader w:val="0"/>
+        </w:trPr>
+        <w:tc>
+          <w:tcPr>
+            <w:tcMar>
+              <w:top w:w="60.0" w:type="dxa"/>
+              <w:left w:w="100.0" w:type="dxa"/>
+              <w:bottom w:w="60.0" w:type="dxa"/>
+              <w:right w:w="100.0" w:type="dxa"/>
+            </w:tcMar>
+          </w:tcPr>
+          <w:p>
+            <w:pPr>
+              <w:spacing w:after="0" w:lineRule="auto"/>
+              <w:rPr/>
+            </w:pPr>
+            <w:r>
+              <w:rPr>
+                <w:rFonts w:ascii="Arial" w:cs="Arial" w:eastAsia="Arial" w:hAnsi="Arial"/>
+                <w:b w:val="0"/>
+                <w:bCs w:val="0"/>
+                <w:i w:val="0"/>
+                <w:iCs w:val="0"/>
+                <w:sz w:val="18"/>
+                <w:szCs w:val="18"/>
+                <w:rtl w:val="0"/>
+              </w:rPr>
+              <w:t xml:space="preserve">Containment hiện tại </w:t>
+            </w:r>
+            <w:r>
+              <w:rPr>
+                <w:rtl w:val="0"/>
+              </w:rPr>
+            </w:r>
+          </w:p>
+        </w:tc>
+        <w:tc>
+          <w:tcPr>
+            <w:tcMar>
+              <w:top w:w="60.0" w:type="dxa"/>
+              <w:left w:w="100.0" w:type="dxa"/>
+              <w:bottom w:w="60.0" w:type="dxa"/>
+              <w:right w:w="100.0" w:type="dxa"/>
+            </w:tcMar>
+          </w:tcPr>
+          <w:p>
+            <w:r>
+              <w:t>82,00% (ước tính từ bộ eval nội bộ 500 ca; đối chiếu lại ở pilot)</w:t>
+            </w:r>
+          </w:p>
+        </w:tc>
+        <w:tc>
+          <w:tcPr>
+            <w:tcMar>
+              <w:top w:w="60.0" w:type="dxa"/>
+              <w:left w:w="100.0" w:type="dxa"/>
+              <w:bottom w:w="60.0" w:type="dxa"/>
+              <w:right w:w="100.0" w:type="dxa"/>
+            </w:tcMar>
+          </w:tcPr>
+          <w:p>
+            <w:pPr>
+              <w:spacing w:after="0" w:lineRule="auto"/>
+              <w:rPr/>
+            </w:pPr>
+            <w:r>
+              <w:rPr>
+                <w:rFonts w:ascii="Arial" w:cs="Arial" w:eastAsia="Arial" w:hAnsi="Arial"/>
+                <w:b w:val="0"/>
+                <w:bCs w:val="0"/>
+                <w:i w:val="0"/>
+                <w:iCs w:val="0"/>
+                <w:sz w:val="16"/>
+                <w:szCs w:val="16"/>
+                <w:rtl w:val="0"/>
+              </w:rPr>
               <w:t xml:space="preserve">1_Cost_Job!B10</w:t>
+            </w:r>
+            <w:r>
+              <w:rPr>
+                <w:rtl w:val="0"/>
+              </w:rPr>
+            </w:r>
+          </w:p>
+        </w:tc>
+      </w:tr>
+      <w:tr>
+        <w:trPr>
+          <w:cantSplit w:val="0"/>
+          <w:tblHeader w:val="0"/>
+        </w:trPr>
+        <w:tc>
+          <w:tcPr>
+            <w:tcMar>
+              <w:top w:w="60.0" w:type="dxa"/>
+              <w:left w:w="100.0" w:type="dxa"/>
+              <w:bottom w:w="60.0" w:type="dxa"/>
+              <w:right w:w="100.0" w:type="dxa"/>
+            </w:tcMar>
+          </w:tcPr>
+          <w:p>
+            <w:pPr>
+              <w:spacing w:after="0" w:lineRule="auto"/>
+              <w:rPr/>
+            </w:pPr>
+            <w:r>
+              <w:rPr>
+                <w:rFonts w:ascii="Arial" w:cs="Arial" w:eastAsia="Arial" w:hAnsi="Arial"/>
+                <w:b w:val="0"/>
+                <w:bCs w:val="0"/>
+                <w:i w:val="0"/>
+                <w:iCs w:val="0"/>
+                <w:sz w:val="18"/>
+                <w:szCs w:val="18"/>
+                <w:rtl w:val="0"/>
+              </w:rPr>
+              <w:t>Đệm an toàn</w:t>
+            </w:r>
+            <w:r>
+              <w:rPr>
+                <w:rtl w:val="0"/>
+              </w:rPr>
+            </w:r>
+          </w:p>
+        </w:tc>
+        <w:tc>
+          <w:tcPr>
+            <w:tcMar>
+              <w:top w:w="60.0" w:type="dxa"/>
+              <w:left w:w="100.0" w:type="dxa"/>
+              <w:bottom w:w="60.0" w:type="dxa"/>
+              <w:right w:w="100.0" w:type="dxa"/>
+            </w:tcMar>
+          </w:tcPr>
+          <w:p>
+            <w:r>
+              <w:t>4,59 điểm % (82% − 77,41%)</w:t>
+            </w:r>
+          </w:p>
+        </w:tc>
+        <w:tc>
+          <w:tcPr>
+            <w:tcMar>
+              <w:top w:w="60.0" w:type="dxa"/>
+              <w:left w:w="100.0" w:type="dxa"/>
+              <w:bottom w:w="60.0" w:type="dxa"/>
+              <w:right w:w="100.0" w:type="dxa"/>
+            </w:tcMar>
+          </w:tcPr>
+          <w:p>
+            <w:pPr>
+              <w:spacing w:after="0" w:lineRule="auto"/>
+              <w:rPr/>
+            </w:pPr>
+            <w:r>
+              <w:rPr>
+                <w:rFonts w:ascii="Arial" w:cs="Arial" w:eastAsia="Arial" w:hAnsi="Arial"/>
+                <w:b w:val="0"/>
+                <w:bCs w:val="0"/>
+                <w:i w:val="0"/>
+                <w:iCs w:val="0"/>
+                <w:sz w:val="16"/>
+                <w:szCs w:val="16"/>
+                <w:rtl w:val="0"/>
+              </w:rPr>
+              <w:t>2_Pricing!B61</w:t>
             </w:r>
             <w:r>
               <w:rPr>
@@ -1145,7 +1456,7 @@
         <w:rPr/>
       </w:pPr>
       <w:r>
-        <w:t>- Neo theo nhân công (50–70%): Một nhân viên CSKH trực ca đêm có chi phí fully-loaded $1.500/tháng (xử lý ~1.000 ticket, tương đương $1,50/ticket). Giá $0,99 tương đương 66% chi phí nhân công, giúp shop tiết kiệm ngay 34% chi phí trực tiếp.</w:t>
+        <w:t>- Neo theo nhân công (50–70%) — chỉ để đối chiếu, không phải điểm bán chính: Lương trực đêm ≈ $350/tháng (8–10 triệu ₫; 2_Pricing!B14). Shop điển hình ~250 ticket/tháng, ~205 được giải quyết → trả ≈ $203/tháng ≈ 58% lương 1 người, nhưng phủ 24/7. Trần theo nhân công 50–70% ≈ $0,70–0,98/job (2_Pricing!B15–B16); giá $0,99 nằm sát đỉnh vùng này → neo chính vẫn là giá trị giữ lại, không bán bằng "rẻ hơn lương".</w:t>
       </w:r>
     </w:p>
     <w:p>
@@ -1157,7 +1468,7 @@
         <w:rPr/>
       </w:pPr>
       <w:r>
-        <w:t>- Neo theo giá trị tạo ra (10–25%): Xử lý tức thì ca đêm giúp shop cứu được ít nhất $4.000 doanh thu đơn hàng bỏ rơi mỗi tháng. Mức chi $990/tháng (cho 1.000 ticket) chiếm 24,7% giá trị doanh thu giữ lại được. Khách hàng SME dễ dàng nghiệm thu vì số tiền tiết kiệm và doanh thu giữ lại vượt xa chi phí bỏ ra.</w:t>
+        <w:t>- Neo theo giá trị tạo ra (10–25%) — neo chính: Giả định (sẽ kiểm chứng ở pilot) mỗi shop ~250 ticket/tháng giữ lại được ≈ $1.000 doanh thu đơn hàng ca đêm (2_Pricing!B10). Outcome chỉ tính 820/1.000 ticket thành công, tức ≈ $203/tháng = 20,3% giá trị giữ lại, nằm trong khoảng 10–25% (trần giá trị 2_Pricing!B13 = $1,00/job).</w:t>
       </w:r>
     </w:p>
     <w:p>
@@ -1215,15 +1526,15 @@
         <w:rPr/>
       </w:pPr>
       <w:r>
-        <w:t>Mô hình gãy khi Containment rate tụt xuống dưới 72,68%: ở Biến thể B ta phải chịu chi phí nhân sự escalation $0,90/ca; nếu containment tụt về 60%, Cost/Job vọt lên $0,670 khiến Gross Margin sụp đổ xuống 32,3% (rơi vào vùng nguy hiểm &lt; 50%).</w:t>
-      </w:r>
-    </w:p>
-    <w:p>
-      <w:pPr>
-        <w:rPr/>
-      </w:pPr>
-      <w:r>
-        <w:t>Ngoài ra, mô hình cũng gãy nếu chi phí nhân sự escalation tăng gấp đôi (vượt $18/giờ) mà giá bán không đổi, hoặc tỷ lệ retry/lỗi kỹ thuật vượt quá 25%.</w:t>
+        <w:t>Mô hình gãy khi containment tụt xuống dưới 77,41% (GM sau revenue share &lt; 60%); GM ròng &lt; 50% khi containment &lt; ~72,7%. Ở Biến thể B mỗi ca escalate tốn $0,90. Ở containment 70%, GM ròng 43,7%; ở 60%, Cost/Job vọt lên $0,670 và GM ròng chỉ còn 15,4%. Đệm hiện tại chỉ 4,59 điểm %.</w:t>
+      </w:r>
+    </w:p>
+    <w:p>
+      <w:pPr>
+        <w:rPr/>
+      </w:pPr>
+      <w:r>
+        <w:t>Ngoài ra, nếu chi phí xử lý escalation tăng gấp đôi (≥ $18/giờ), Cost/Job lên ≈ $0,464 và GM ròng còn ≈ 41%.</w:t>
       </w:r>
     </w:p>
     <w:p>
@@ -1304,7 +1615,7 @@
         <w:rPr/>
       </w:pPr>
       <w:r>
-        <w:t>Kênh phân phối chốt: Partner-Led (Đòn bẩy hệ sinh thái đối tác nền tảng bán hàng đa kênh).</w:t>
+        <w:t>Kênh phân phối chốt: Partner-Led (đúng 1 kênh cho 90 ngày đầu).</w:t>
       </w:r>
     </w:p>
     <w:p>
@@ -1316,11 +1627,11 @@
         <w:rPr/>
       </w:pPr>
       <w:r>
-        <w:t>- Tên đối tác cụ thể: Pancake POS &amp; Haravan Omnichannel (Haravan App Store và Pancake Open Platform).</w:t>
+        <w:t>- Tên đối tác cụ thể: Haravan (Haravan App Store). Pancake POS chỉ xét từ Tháng 4+.</w:t>
         <w:br/>
-        <w:t>- Đã nói chuyện chưa: Rồi (Đã đăng ký tài khoản Developer Partner trên Haravan App Partner).</w:t>
+        <w:t>- Đã nói chuyện chưa: Chưa — mới đăng ký tài khoản Developer Partner trên Haravan; chưa có buổi trao đổi với đội partner. Hẹn liên hệ trước 22/10/2026.</w:t>
         <w:br/>
-        <w:t>- Giá trị mang lại cho đối tác: Tăng tỷ lệ giữ chân khách hàng (retention) của Pancake/Haravan bằng cách giải quyết triệt để điểm đau thiếu nhân sự trực ca đêm của các chủ shop bán lẻ; chia sẻ 20% doanh thu (revenue share) trên mỗi resolution cho nền tảng đối tác.</w:t>
+        <w:t>- Giá trị mang lại cho đối tác: Tăng tỷ lệ giữ chân khách hàng (retention) của Haravan bằng cách giải quyết điểm đau thiếu nhân sự trực ca đêm của các chủ shop bán lẻ; chia sẻ 20% doanh thu (revenue share) trên mỗi resolution cho nền tảng đối tác (đã tính vào mô hình: 2_Pricing!B56–B61).</w:t>
       </w:r>
     </w:p>
     <w:p>
@@ -1535,7 +1846,7 @@
           </w:tcPr>
           <w:p>
             <w:r>
-              <w:t>$200 / tháng</w:t>
+              <w:t>$200 / tháng (~250 ticket/shop × 82% × $0,99)</w:t>
             </w:r>
           </w:p>
         </w:tc>
@@ -1624,7 +1935,7 @@
           </w:tcPr>
           <w:p>
             <w:r>
-              <w:t>$1.797,28 / khách</w:t>
+              <w:t>$1.646,60 / khách ($200 × GM ròng 68,61% × 12)</w:t>
             </w:r>
           </w:p>
         </w:tc>
@@ -1713,7 +2024,7 @@
           </w:tcPr>
           <w:p>
             <w:r>
-              <w:t>0,83 deal / ngày</w:t>
+              <w:t>0,83 deal / ngày (≤ 1 nên chưa loại về số học; kết luận dựa vào CAC)</w:t>
             </w:r>
           </w:p>
         </w:tc>
@@ -1891,7 +2202,7 @@
           </w:tcPr>
           <w:p>
             <w:r>
-              <w:t>17,8 lần (Bất khả thi nuôi Sales)</w:t>
+              <w:t>19,4 lần (Bất khả thi nuôi Sales)</w:t>
             </w:r>
           </w:p>
         </w:tc>
@@ -1997,7 +2308,7 @@
         <w:rPr/>
       </w:pPr>
       <w:r>
-        <w:t>23:00 – 02:00 đêm (Mấy giờ) + Chủ shop / Lead CSKH đang bị dồn ứ 30–50 tin nhắn hỏi đơn, check tồn và khiếu nại giao hàng mà nhân viên ca đêm đã nghỉ hoặc ngủ quên, nguy cơ bị bom đơn và đánh giá 1 sao (Đang làm gì) + Đang mở hộp thư hội thoại tập trung Pancake POS / Haravan Chat (Dùng app nào).</w:t>
+        <w:t>23:00 – 02:00 đêm (Mấy giờ) + Chủ shop / Lead CSKH đang bị dồn ứ 30–50 tin nhắn hỏi đơn, check tồn và khiếu nại giao hàng mà nhân viên ca đêm đã nghỉ hoặc ngủ quên, nguy cơ bị bom đơn và đánh giá 1 sao (Đang làm gì) + Đang mở hộp thư hội thoại đa kênh của Haravan; tên bề mặt chính xác cần xác minh trên trang developer Haravan (Dùng app nào).</w:t>
       </w:r>
     </w:p>
     <w:p>
@@ -2067,7 +2378,7 @@
         <w:rPr/>
       </w:pPr>
       <w:r>
-        <w:t>App Extension / Webhook Plugin tích hợp trực tiếp ngay trong giao diện hộp thư hội thoại Pancake POS / Haravan OmniCare. Chủ shop chỉ cần bật nút toggle 'Bật AutoResolve Ca Đêm' ngay trên màn hình chat quen thuộc, không cần mở tab mới, không cần học workflow mới và không cần cài thêm phần mềm riêng biệt.</w:t>
+        <w:t>App Extension / Webhook Plugin tích hợp trực tiếp ngay trong giao diện hộp thư hội thoại Haravan. Chủ shop chỉ cần bật nút toggle 'Bật AutoResolve Ca Đêm' ngay trên màn hình chat quen thuộc, không cần mở tab mới, không cần học workflow mới và không cần cài thêm phần mềm riêng biệt.</w:t>
       </w:r>
     </w:p>
     <w:p>
@@ -2321,22 +2632,22 @@
           </w:tcPr>
           <w:p>
             <w:r>
-              <w:t>Partner-Led (Publish chính thức lên Haravan App Store &amp; Pancake Marketplace)</w:t>
-            </w:r>
-          </w:p>
-        </w:tc>
-        <w:tc>
-          <w:tcPr>
-            <w:tcMar>
-              <w:top w:w="60.0" w:type="dxa"/>
-              <w:left w:w="100.0" w:type="dxa"/>
-              <w:bottom w:w="60.0" w:type="dxa"/>
-              <w:right w:w="100.0" w:type="dxa"/>
-            </w:tcMar>
-          </w:tcPr>
-          <w:p>
-            <w:r>
-              <w:t>Partner-Led mở rộng sang Sapo &amp; TikTok Shop Partner Ecosystem</w:t>
+              <w:t>Partner-Led (Publish chính thức lên Haravan App Store)</w:t>
+            </w:r>
+          </w:p>
+        </w:tc>
+        <w:tc>
+          <w:tcPr>
+            <w:tcMar>
+              <w:top w:w="60.0" w:type="dxa"/>
+              <w:left w:w="100.0" w:type="dxa"/>
+              <w:bottom w:w="60.0" w:type="dxa"/>
+              <w:right w:w="100.0" w:type="dxa"/>
+            </w:tcMar>
+          </w:tcPr>
+          <w:p>
+            <w:r>
+              <w:t>Partner-Led: thêm Pancake POS, sau đó Sapo (chỉ khi Haravan đạt KPI)</w:t>
             </w:r>
           </w:p>
         </w:tc>
@@ -2491,7 +2802,7 @@
           </w:tcPr>
           <w:p>
             <w:r>
-              <w:t>Hoàn thiện luồng One-Click Install + Auto Billing; chạy webinar co-marketing với Partner 'Cứu 30% doanh thu ca đêm'.</w:t>
+              <w:t>Hoàn thiện luồng One-Click Install + Auto Billing; chạy webinar co-marketing với Haravan 'Cứu doanh thu ca đêm'.</w:t>
             </w:r>
           </w:p>
         </w:tc>
@@ -2576,22 +2887,22 @@
           </w:tcPr>
           <w:p>
             <w:r>
-              <w:t>30 shop hoạt động; 25.000 resolution/tháng; Churn rate &lt; 5%/tháng; Partner conversion rate &gt; 12%.</w:t>
-            </w:r>
-          </w:p>
-        </w:tc>
-        <w:tc>
-          <w:tcPr>
-            <w:tcMar>
-              <w:top w:w="60.0" w:type="dxa"/>
-              <w:left w:w="100.0" w:type="dxa"/>
-              <w:bottom w:w="60.0" w:type="dxa"/>
-              <w:right w:w="100.0" w:type="dxa"/>
-            </w:tcMar>
-          </w:tcPr>
-          <w:p>
-            <w:r>
-              <w:t>100 shop; MRR đạt $20.000; Gross Margin duy trì ≥ 75%; NPS ≥ 55.</w:t>
+              <w:t>30 shop hoạt động (~6.000 resolution/tháng, MRR ≈ $6.000); Churn rate &lt; 5%/tháng; Partner conversion rate &gt; 12%.</w:t>
+            </w:r>
+          </w:p>
+        </w:tc>
+        <w:tc>
+          <w:tcPr>
+            <w:tcMar>
+              <w:top w:w="60.0" w:type="dxa"/>
+              <w:left w:w="100.0" w:type="dxa"/>
+              <w:bottom w:w="60.0" w:type="dxa"/>
+              <w:right w:w="100.0" w:type="dxa"/>
+            </w:tcMar>
+          </w:tcPr>
+          <w:p>
+            <w:r>
+              <w:t>100 shop; MRR ≈ $20.000; GM sau revenue share duy trì ≥ 68%; NPS ≥ 55.</w:t>
             </w:r>
           </w:p>
         </w:tc>
@@ -2661,7 +2972,7 @@
           </w:tcPr>
           <w:p>
             <w:r>
-              <w:t>Đàm Quang Trung (Product) &amp; Nguyễn Văn A (Partnership)</w:t>
+              <w:t>Đàm Quang Trung (Product) &amp; Partnership Lead (đang tuyển, chốt trước 30/11/2026)</w:t>
             </w:r>
           </w:p>
         </w:tc>
@@ -2980,7 +3291,7 @@
           </w:tcPr>
           <w:p>
             <w:r>
-              <w:t>AI xử lý đúng và tự giải quyết thành công 82% ticket (containment rate); 18% còn lại chuyển chính xác cho nhân viên con người xử lý mà không gây sai sót thông tin.</w:t>
+              <w:t>Bộ eval nội bộ 500 test cases cho containment rate 82% (số ước tính ban đầu; sẽ đối chiếu lại bằng dữ liệu thật ở pilot).</w:t>
             </w:r>
           </w:p>
         </w:tc>
@@ -3150,7 +3461,7 @@
           </w:tcPr>
           <w:p>
             <w:r>
-              <w:t>Báo cáo thử nghiệm thực tế: Pilot 4 tuần trên 5 shop SME, xử lý 5.000 lượt ticket, containment rate đạt 82,4%, tiết kiệm 180 giờ trực đêm của nhân viên và giảm 65% thời gian phản hồi đầu tiên.</w:t>
+              <w:t>MỤC TIÊU (chưa có kết quả): pilot 4 tuần trên 5 shop SME (~1.250 ticket), đo containment (mục tiêu ≥ 80%), giờ trực đêm tiết kiệm và thời gian phản hồi đầu tiên.</w:t>
             </w:r>
           </w:p>
         </w:tc>
@@ -3243,7 +3554,7 @@
         <w:rPr/>
       </w:pPr>
       <w:r>
-        <w:t>☑  Có lãi trên mỗi đơn vị không — con số nào chứng minh? -&gt; Có lãi, Cost/Job $0,2486 so với giá bán $0,99 cho Gross Margin 74,89% (vượt ngưỡng an toàn 60%).</w:t>
+        <w:t>☑  Có lãi trên mỗi đơn vị không — con số nào chứng minh? -&gt; Có lãi, Cost/Job $0,2486 so với giá bán $0,99: GM 74,89%, còn 68,61% sau khi chia 20% cho partner (vẫn vượt ngưỡng 60%).</w:t>
       </w:r>
     </w:p>
     <w:p>
@@ -3252,7 +3563,7 @@
         <w:rPr/>
       </w:pPr>
       <w:r>
-        <w:t>☑  Tiếp cận khách qua đâu — và vì sao là kênh đó? -&gt; Partner-Led cắm vào Pancake/Haravan vì ngân sách CAC $1.797 không thể nuôi Direct Sales (lệch 17,8 lần).</w:t>
+        <w:t>☑  Tiếp cận khách qua đâu — và vì sao là kênh đó? -&gt; Partner-Led cắm vào Haravan vì ngân sách CAC $1.647 không thể nuôi Direct Sales (CAC thực tế $32.000, lệch 19,4 lần).</w:t>
       </w:r>
     </w:p>
     <w:p>

</xml_diff>